<commit_message>
Boyama sayfaları yenilendi: yeni çizimler, kodlu boyama ve simetri, Sayfa Seç sayfası
Co-Authored-By: Claude Opus 5.5 <noreply@anthropic.com>
Claude-Session: https://claude.ai/code/session_01GEutC5KHZ6AsZq3kXMnJqq
</commit_message>
<xml_diff>
--- a/boyama-sayfalari.docx
+++ b/boyama-sayfalari.docx
@@ -3,13 +3,10 @@
 <w:document xmlns:wpc="http://schemas.microsoft.com/office/word/2010/wordprocessingCanvas" xmlns:mo="http://schemas.microsoft.com/office/mac/office/2008/main" xmlns:mc="http://schemas.openxmlformats.org/markup-compatibility/2006" xmlns:mv="urn:schemas-microsoft-com:mac:vml" xmlns:o="urn:schemas-microsoft-com:office:office" xmlns:r="http://schemas.openxmlformats.org/officeDocument/2006/relationships" xmlns:m="http://schemas.openxmlformats.org/officeDocument/2006/math" xmlns:v="urn:schemas-microsoft-com:vml" xmlns:wp14="http://schemas.microsoft.com/office/word/2010/wordprocessingDrawing" xmlns:wp="http://schemas.openxmlformats.org/drawingml/2006/wordprocessingDrawing" xmlns:w10="urn:schemas-microsoft-com:office:word" xmlns:w="http://schemas.openxmlformats.org/wordprocessingml/2006/main" xmlns:w14="http://schemas.microsoft.com/office/word/2010/wordml" xmlns:wpg="http://schemas.microsoft.com/office/word/2010/wordprocessingGroup" xmlns:wpi="http://schemas.microsoft.com/office/word/2010/wordprocessingInk" xmlns:wne="http://schemas.microsoft.com/office/word/2006/wordml" xmlns:wps="http://schemas.microsoft.com/office/word/2010/wordprocessingShape" mc:Ignorable="w14 wp14">
   <w:body>
     <w:p>
-      <w:pPr>
-        <w:spacing w:before="0" w:after="0" w:line="240" w:lineRule="auto"/>
-      </w:pPr>
       <w:r>
         <w:drawing>
           <wp:inline xmlns:a="http://schemas.openxmlformats.org/drawingml/2006/main" xmlns:pic="http://schemas.openxmlformats.org/drawingml/2006/picture">
-            <wp:extent cx="7567200" cy="10702800"/>
+            <wp:extent cx="7510938" cy="10620000"/>
             <wp:docPr id="1" name="Picture 1"/>
             <wp:cNvGraphicFramePr>
               <a:graphicFrameLocks noChangeAspect="1"/>
@@ -18,7 +15,7 @@
               <a:graphicData uri="http://schemas.openxmlformats.org/drawingml/2006/picture">
                 <pic:pic>
                   <pic:nvPicPr>
-                    <pic:cNvPr id="0" name="image.jpg"/>
+                    <pic:cNvPr id="0" name="01.png"/>
                     <pic:cNvPicPr/>
                   </pic:nvPicPr>
                   <pic:blipFill>
@@ -30,7 +27,7 @@
                   <pic:spPr>
                     <a:xfrm>
                       <a:off x="0" y="0"/>
-                      <a:ext cx="7567200" cy="10702800"/>
+                      <a:ext cx="7510938" cy="10620000"/>
                     </a:xfrm>
                     <a:prstGeom prst="rect"/>
                   </pic:spPr>
@@ -43,22 +40,12 @@
     </w:p>
     <w:p>
       <w:pPr>
-        <w:sectPr>
-          <w:pgSz w:w="11917" w:h="16855"/>
-          <w:pgMar w:top="0" w:right="0" w:bottom="0" w:left="0" w:header="0" w:footer="0" w:gutter="0"/>
-          <w:cols w:space="720"/>
-          <w:docGrid w:linePitch="360"/>
-        </w:sectPr>
-      </w:pPr>
-    </w:p>
-    <w:p>
-      <w:pPr>
-        <w:spacing w:before="0" w:after="0" w:line="240" w:lineRule="auto"/>
+        <w:pageBreakBefore/>
       </w:pPr>
       <w:r>
         <w:drawing>
           <wp:inline xmlns:a="http://schemas.openxmlformats.org/drawingml/2006/main" xmlns:pic="http://schemas.openxmlformats.org/drawingml/2006/picture">
-            <wp:extent cx="7567200" cy="10702800"/>
+            <wp:extent cx="7510938" cy="10620000"/>
             <wp:docPr id="2" name="Picture 2"/>
             <wp:cNvGraphicFramePr>
               <a:graphicFrameLocks noChangeAspect="1"/>
@@ -67,7 +54,7 @@
               <a:graphicData uri="http://schemas.openxmlformats.org/drawingml/2006/picture">
                 <pic:pic>
                   <pic:nvPicPr>
-                    <pic:cNvPr id="0" name="image.jpg"/>
+                    <pic:cNvPr id="0" name="02.png"/>
                     <pic:cNvPicPr/>
                   </pic:nvPicPr>
                   <pic:blipFill>
@@ -79,7 +66,7 @@
                   <pic:spPr>
                     <a:xfrm>
                       <a:off x="0" y="0"/>
-                      <a:ext cx="7567200" cy="10702800"/>
+                      <a:ext cx="7510938" cy="10620000"/>
                     </a:xfrm>
                     <a:prstGeom prst="rect"/>
                   </pic:spPr>
@@ -92,22 +79,12 @@
     </w:p>
     <w:p>
       <w:pPr>
-        <w:sectPr>
-          <w:pgSz w:w="11917" w:h="16855"/>
-          <w:pgMar w:top="0" w:right="0" w:bottom="0" w:left="0" w:header="0" w:footer="0" w:gutter="0"/>
-          <w:cols w:space="720"/>
-          <w:docGrid w:linePitch="360"/>
-        </w:sectPr>
-      </w:pPr>
-    </w:p>
-    <w:p>
-      <w:pPr>
-        <w:spacing w:before="0" w:after="0" w:line="240" w:lineRule="auto"/>
+        <w:pageBreakBefore/>
       </w:pPr>
       <w:r>
         <w:drawing>
           <wp:inline xmlns:a="http://schemas.openxmlformats.org/drawingml/2006/main" xmlns:pic="http://schemas.openxmlformats.org/drawingml/2006/picture">
-            <wp:extent cx="7567200" cy="10702800"/>
+            <wp:extent cx="7510938" cy="10620000"/>
             <wp:docPr id="3" name="Picture 3"/>
             <wp:cNvGraphicFramePr>
               <a:graphicFrameLocks noChangeAspect="1"/>
@@ -116,7 +93,7 @@
               <a:graphicData uri="http://schemas.openxmlformats.org/drawingml/2006/picture">
                 <pic:pic>
                   <pic:nvPicPr>
-                    <pic:cNvPr id="0" name="image.jpg"/>
+                    <pic:cNvPr id="0" name="03.png"/>
                     <pic:cNvPicPr/>
                   </pic:nvPicPr>
                   <pic:blipFill>
@@ -128,7 +105,7 @@
                   <pic:spPr>
                     <a:xfrm>
                       <a:off x="0" y="0"/>
-                      <a:ext cx="7567200" cy="10702800"/>
+                      <a:ext cx="7510938" cy="10620000"/>
                     </a:xfrm>
                     <a:prstGeom prst="rect"/>
                   </pic:spPr>
@@ -141,22 +118,12 @@
     </w:p>
     <w:p>
       <w:pPr>
-        <w:sectPr>
-          <w:pgSz w:w="11917" w:h="16855"/>
-          <w:pgMar w:top="0" w:right="0" w:bottom="0" w:left="0" w:header="0" w:footer="0" w:gutter="0"/>
-          <w:cols w:space="720"/>
-          <w:docGrid w:linePitch="360"/>
-        </w:sectPr>
-      </w:pPr>
-    </w:p>
-    <w:p>
-      <w:pPr>
-        <w:spacing w:before="0" w:after="0" w:line="240" w:lineRule="auto"/>
+        <w:pageBreakBefore/>
       </w:pPr>
       <w:r>
         <w:drawing>
           <wp:inline xmlns:a="http://schemas.openxmlformats.org/drawingml/2006/main" xmlns:pic="http://schemas.openxmlformats.org/drawingml/2006/picture">
-            <wp:extent cx="7567200" cy="10702800"/>
+            <wp:extent cx="7510938" cy="10620000"/>
             <wp:docPr id="4" name="Picture 4"/>
             <wp:cNvGraphicFramePr>
               <a:graphicFrameLocks noChangeAspect="1"/>
@@ -165,7 +132,7 @@
               <a:graphicData uri="http://schemas.openxmlformats.org/drawingml/2006/picture">
                 <pic:pic>
                   <pic:nvPicPr>
-                    <pic:cNvPr id="0" name="image.jpg"/>
+                    <pic:cNvPr id="0" name="04.png"/>
                     <pic:cNvPicPr/>
                   </pic:nvPicPr>
                   <pic:blipFill>
@@ -177,7 +144,7 @@
                   <pic:spPr>
                     <a:xfrm>
                       <a:off x="0" y="0"/>
-                      <a:ext cx="7567200" cy="10702800"/>
+                      <a:ext cx="7510938" cy="10620000"/>
                     </a:xfrm>
                     <a:prstGeom prst="rect"/>
                   </pic:spPr>
@@ -190,22 +157,12 @@
     </w:p>
     <w:p>
       <w:pPr>
-        <w:sectPr>
-          <w:pgSz w:w="11917" w:h="16855"/>
-          <w:pgMar w:top="0" w:right="0" w:bottom="0" w:left="0" w:header="0" w:footer="0" w:gutter="0"/>
-          <w:cols w:space="720"/>
-          <w:docGrid w:linePitch="360"/>
-        </w:sectPr>
-      </w:pPr>
-    </w:p>
-    <w:p>
-      <w:pPr>
-        <w:spacing w:before="0" w:after="0" w:line="240" w:lineRule="auto"/>
+        <w:pageBreakBefore/>
       </w:pPr>
       <w:r>
         <w:drawing>
           <wp:inline xmlns:a="http://schemas.openxmlformats.org/drawingml/2006/main" xmlns:pic="http://schemas.openxmlformats.org/drawingml/2006/picture">
-            <wp:extent cx="7567200" cy="10702800"/>
+            <wp:extent cx="7510938" cy="10620000"/>
             <wp:docPr id="5" name="Picture 5"/>
             <wp:cNvGraphicFramePr>
               <a:graphicFrameLocks noChangeAspect="1"/>
@@ -214,7 +171,7 @@
               <a:graphicData uri="http://schemas.openxmlformats.org/drawingml/2006/picture">
                 <pic:pic>
                   <pic:nvPicPr>
-                    <pic:cNvPr id="0" name="image.jpg"/>
+                    <pic:cNvPr id="0" name="05.png"/>
                     <pic:cNvPicPr/>
                   </pic:nvPicPr>
                   <pic:blipFill>
@@ -226,7 +183,7 @@
                   <pic:spPr>
                     <a:xfrm>
                       <a:off x="0" y="0"/>
-                      <a:ext cx="7567200" cy="10702800"/>
+                      <a:ext cx="7510938" cy="10620000"/>
                     </a:xfrm>
                     <a:prstGeom prst="rect"/>
                   </pic:spPr>
@@ -239,22 +196,12 @@
     </w:p>
     <w:p>
       <w:pPr>
-        <w:sectPr>
-          <w:pgSz w:w="11917" w:h="16855"/>
-          <w:pgMar w:top="0" w:right="0" w:bottom="0" w:left="0" w:header="0" w:footer="0" w:gutter="0"/>
-          <w:cols w:space="720"/>
-          <w:docGrid w:linePitch="360"/>
-        </w:sectPr>
-      </w:pPr>
-    </w:p>
-    <w:p>
-      <w:pPr>
-        <w:spacing w:before="0" w:after="0" w:line="240" w:lineRule="auto"/>
+        <w:pageBreakBefore/>
       </w:pPr>
       <w:r>
         <w:drawing>
           <wp:inline xmlns:a="http://schemas.openxmlformats.org/drawingml/2006/main" xmlns:pic="http://schemas.openxmlformats.org/drawingml/2006/picture">
-            <wp:extent cx="7567200" cy="10702800"/>
+            <wp:extent cx="7510938" cy="10620000"/>
             <wp:docPr id="6" name="Picture 6"/>
             <wp:cNvGraphicFramePr>
               <a:graphicFrameLocks noChangeAspect="1"/>
@@ -263,7 +210,7 @@
               <a:graphicData uri="http://schemas.openxmlformats.org/drawingml/2006/picture">
                 <pic:pic>
                   <pic:nvPicPr>
-                    <pic:cNvPr id="0" name="image.jpg"/>
+                    <pic:cNvPr id="0" name="06.png"/>
                     <pic:cNvPicPr/>
                   </pic:nvPicPr>
                   <pic:blipFill>
@@ -275,7 +222,7 @@
                   <pic:spPr>
                     <a:xfrm>
                       <a:off x="0" y="0"/>
-                      <a:ext cx="7567200" cy="10702800"/>
+                      <a:ext cx="7510938" cy="10620000"/>
                     </a:xfrm>
                     <a:prstGeom prst="rect"/>
                   </pic:spPr>
@@ -288,22 +235,12 @@
     </w:p>
     <w:p>
       <w:pPr>
-        <w:sectPr>
-          <w:pgSz w:w="11917" w:h="16855"/>
-          <w:pgMar w:top="0" w:right="0" w:bottom="0" w:left="0" w:header="0" w:footer="0" w:gutter="0"/>
-          <w:cols w:space="720"/>
-          <w:docGrid w:linePitch="360"/>
-        </w:sectPr>
-      </w:pPr>
-    </w:p>
-    <w:p>
-      <w:pPr>
-        <w:spacing w:before="0" w:after="0" w:line="240" w:lineRule="auto"/>
+        <w:pageBreakBefore/>
       </w:pPr>
       <w:r>
         <w:drawing>
           <wp:inline xmlns:a="http://schemas.openxmlformats.org/drawingml/2006/main" xmlns:pic="http://schemas.openxmlformats.org/drawingml/2006/picture">
-            <wp:extent cx="7567200" cy="10702800"/>
+            <wp:extent cx="7510938" cy="10620000"/>
             <wp:docPr id="7" name="Picture 7"/>
             <wp:cNvGraphicFramePr>
               <a:graphicFrameLocks noChangeAspect="1"/>
@@ -312,7 +249,7 @@
               <a:graphicData uri="http://schemas.openxmlformats.org/drawingml/2006/picture">
                 <pic:pic>
                   <pic:nvPicPr>
-                    <pic:cNvPr id="0" name="image.jpg"/>
+                    <pic:cNvPr id="0" name="07.png"/>
                     <pic:cNvPicPr/>
                   </pic:nvPicPr>
                   <pic:blipFill>
@@ -324,7 +261,7 @@
                   <pic:spPr>
                     <a:xfrm>
                       <a:off x="0" y="0"/>
-                      <a:ext cx="7567200" cy="10702800"/>
+                      <a:ext cx="7510938" cy="10620000"/>
                     </a:xfrm>
                     <a:prstGeom prst="rect"/>
                   </pic:spPr>
@@ -337,22 +274,12 @@
     </w:p>
     <w:p>
       <w:pPr>
-        <w:sectPr>
-          <w:pgSz w:w="11917" w:h="16855"/>
-          <w:pgMar w:top="0" w:right="0" w:bottom="0" w:left="0" w:header="0" w:footer="0" w:gutter="0"/>
-          <w:cols w:space="720"/>
-          <w:docGrid w:linePitch="360"/>
-        </w:sectPr>
-      </w:pPr>
-    </w:p>
-    <w:p>
-      <w:pPr>
-        <w:spacing w:before="0" w:after="0" w:line="240" w:lineRule="auto"/>
+        <w:pageBreakBefore/>
       </w:pPr>
       <w:r>
         <w:drawing>
           <wp:inline xmlns:a="http://schemas.openxmlformats.org/drawingml/2006/main" xmlns:pic="http://schemas.openxmlformats.org/drawingml/2006/picture">
-            <wp:extent cx="7567200" cy="10702800"/>
+            <wp:extent cx="7510938" cy="10620000"/>
             <wp:docPr id="8" name="Picture 8"/>
             <wp:cNvGraphicFramePr>
               <a:graphicFrameLocks noChangeAspect="1"/>
@@ -361,7 +288,7 @@
               <a:graphicData uri="http://schemas.openxmlformats.org/drawingml/2006/picture">
                 <pic:pic>
                   <pic:nvPicPr>
-                    <pic:cNvPr id="0" name="image.jpg"/>
+                    <pic:cNvPr id="0" name="08.png"/>
                     <pic:cNvPicPr/>
                   </pic:nvPicPr>
                   <pic:blipFill>
@@ -373,7 +300,7 @@
                   <pic:spPr>
                     <a:xfrm>
                       <a:off x="0" y="0"/>
-                      <a:ext cx="7567200" cy="10702800"/>
+                      <a:ext cx="7510938" cy="10620000"/>
                     </a:xfrm>
                     <a:prstGeom prst="rect"/>
                   </pic:spPr>
@@ -386,22 +313,12 @@
     </w:p>
     <w:p>
       <w:pPr>
-        <w:sectPr>
-          <w:pgSz w:w="11917" w:h="16855"/>
-          <w:pgMar w:top="0" w:right="0" w:bottom="0" w:left="0" w:header="0" w:footer="0" w:gutter="0"/>
-          <w:cols w:space="720"/>
-          <w:docGrid w:linePitch="360"/>
-        </w:sectPr>
-      </w:pPr>
-    </w:p>
-    <w:p>
-      <w:pPr>
-        <w:spacing w:before="0" w:after="0" w:line="240" w:lineRule="auto"/>
+        <w:pageBreakBefore/>
       </w:pPr>
       <w:r>
         <w:drawing>
           <wp:inline xmlns:a="http://schemas.openxmlformats.org/drawingml/2006/main" xmlns:pic="http://schemas.openxmlformats.org/drawingml/2006/picture">
-            <wp:extent cx="7567200" cy="10702800"/>
+            <wp:extent cx="7510938" cy="10620000"/>
             <wp:docPr id="9" name="Picture 9"/>
             <wp:cNvGraphicFramePr>
               <a:graphicFrameLocks noChangeAspect="1"/>
@@ -410,7 +327,7 @@
               <a:graphicData uri="http://schemas.openxmlformats.org/drawingml/2006/picture">
                 <pic:pic>
                   <pic:nvPicPr>
-                    <pic:cNvPr id="0" name="image.jpg"/>
+                    <pic:cNvPr id="0" name="09.png"/>
                     <pic:cNvPicPr/>
                   </pic:nvPicPr>
                   <pic:blipFill>
@@ -422,7 +339,7 @@
                   <pic:spPr>
                     <a:xfrm>
                       <a:off x="0" y="0"/>
-                      <a:ext cx="7567200" cy="10702800"/>
+                      <a:ext cx="7510938" cy="10620000"/>
                     </a:xfrm>
                     <a:prstGeom prst="rect"/>
                   </pic:spPr>
@@ -435,22 +352,12 @@
     </w:p>
     <w:p>
       <w:pPr>
-        <w:sectPr>
-          <w:pgSz w:w="11917" w:h="16855"/>
-          <w:pgMar w:top="0" w:right="0" w:bottom="0" w:left="0" w:header="0" w:footer="0" w:gutter="0"/>
-          <w:cols w:space="720"/>
-          <w:docGrid w:linePitch="360"/>
-        </w:sectPr>
-      </w:pPr>
-    </w:p>
-    <w:p>
-      <w:pPr>
-        <w:spacing w:before="0" w:after="0" w:line="240" w:lineRule="auto"/>
+        <w:pageBreakBefore/>
       </w:pPr>
       <w:r>
         <w:drawing>
           <wp:inline xmlns:a="http://schemas.openxmlformats.org/drawingml/2006/main" xmlns:pic="http://schemas.openxmlformats.org/drawingml/2006/picture">
-            <wp:extent cx="7567200" cy="10702800"/>
+            <wp:extent cx="7510938" cy="10620000"/>
             <wp:docPr id="10" name="Picture 10"/>
             <wp:cNvGraphicFramePr>
               <a:graphicFrameLocks noChangeAspect="1"/>
@@ -459,7 +366,7 @@
               <a:graphicData uri="http://schemas.openxmlformats.org/drawingml/2006/picture">
                 <pic:pic>
                   <pic:nvPicPr>
-                    <pic:cNvPr id="0" name="image.jpg"/>
+                    <pic:cNvPr id="0" name="10.png"/>
                     <pic:cNvPicPr/>
                   </pic:nvPicPr>
                   <pic:blipFill>
@@ -471,7 +378,7 @@
                   <pic:spPr>
                     <a:xfrm>
                       <a:off x="0" y="0"/>
-                      <a:ext cx="7567200" cy="10702800"/>
+                      <a:ext cx="7510938" cy="10620000"/>
                     </a:xfrm>
                     <a:prstGeom prst="rect"/>
                   </pic:spPr>
@@ -484,22 +391,12 @@
     </w:p>
     <w:p>
       <w:pPr>
-        <w:sectPr>
-          <w:pgSz w:w="11917" w:h="16855"/>
-          <w:pgMar w:top="0" w:right="0" w:bottom="0" w:left="0" w:header="0" w:footer="0" w:gutter="0"/>
-          <w:cols w:space="720"/>
-          <w:docGrid w:linePitch="360"/>
-        </w:sectPr>
-      </w:pPr>
-    </w:p>
-    <w:p>
-      <w:pPr>
-        <w:spacing w:before="0" w:after="0" w:line="240" w:lineRule="auto"/>
+        <w:pageBreakBefore/>
       </w:pPr>
       <w:r>
         <w:drawing>
           <wp:inline xmlns:a="http://schemas.openxmlformats.org/drawingml/2006/main" xmlns:pic="http://schemas.openxmlformats.org/drawingml/2006/picture">
-            <wp:extent cx="7567200" cy="10702800"/>
+            <wp:extent cx="7510938" cy="10620000"/>
             <wp:docPr id="11" name="Picture 11"/>
             <wp:cNvGraphicFramePr>
               <a:graphicFrameLocks noChangeAspect="1"/>
@@ -508,7 +405,7 @@
               <a:graphicData uri="http://schemas.openxmlformats.org/drawingml/2006/picture">
                 <pic:pic>
                   <pic:nvPicPr>
-                    <pic:cNvPr id="0" name="image.jpg"/>
+                    <pic:cNvPr id="0" name="11.png"/>
                     <pic:cNvPicPr/>
                   </pic:nvPicPr>
                   <pic:blipFill>
@@ -520,7 +417,7 @@
                   <pic:spPr>
                     <a:xfrm>
                       <a:off x="0" y="0"/>
-                      <a:ext cx="7567200" cy="10702800"/>
+                      <a:ext cx="7510938" cy="10620000"/>
                     </a:xfrm>
                     <a:prstGeom prst="rect"/>
                   </pic:spPr>
@@ -533,22 +430,12 @@
     </w:p>
     <w:p>
       <w:pPr>
-        <w:sectPr>
-          <w:pgSz w:w="11917" w:h="16855"/>
-          <w:pgMar w:top="0" w:right="0" w:bottom="0" w:left="0" w:header="0" w:footer="0" w:gutter="0"/>
-          <w:cols w:space="720"/>
-          <w:docGrid w:linePitch="360"/>
-        </w:sectPr>
-      </w:pPr>
-    </w:p>
-    <w:p>
-      <w:pPr>
-        <w:spacing w:before="0" w:after="0" w:line="240" w:lineRule="auto"/>
+        <w:pageBreakBefore/>
       </w:pPr>
       <w:r>
         <w:drawing>
           <wp:inline xmlns:a="http://schemas.openxmlformats.org/drawingml/2006/main" xmlns:pic="http://schemas.openxmlformats.org/drawingml/2006/picture">
-            <wp:extent cx="7567200" cy="10702800"/>
+            <wp:extent cx="7510938" cy="10620000"/>
             <wp:docPr id="12" name="Picture 12"/>
             <wp:cNvGraphicFramePr>
               <a:graphicFrameLocks noChangeAspect="1"/>
@@ -557,7 +444,7 @@
               <a:graphicData uri="http://schemas.openxmlformats.org/drawingml/2006/picture">
                 <pic:pic>
                   <pic:nvPicPr>
-                    <pic:cNvPr id="0" name="image.jpg"/>
+                    <pic:cNvPr id="0" name="12.png"/>
                     <pic:cNvPicPr/>
                   </pic:nvPicPr>
                   <pic:blipFill>
@@ -569,7 +456,7 @@
                   <pic:spPr>
                     <a:xfrm>
                       <a:off x="0" y="0"/>
-                      <a:ext cx="7567200" cy="10702800"/>
+                      <a:ext cx="7510938" cy="10620000"/>
                     </a:xfrm>
                     <a:prstGeom prst="rect"/>
                   </pic:spPr>
@@ -582,22 +469,12 @@
     </w:p>
     <w:p>
       <w:pPr>
-        <w:sectPr>
-          <w:pgSz w:w="11917" w:h="16855"/>
-          <w:pgMar w:top="0" w:right="0" w:bottom="0" w:left="0" w:header="0" w:footer="0" w:gutter="0"/>
-          <w:cols w:space="720"/>
-          <w:docGrid w:linePitch="360"/>
-        </w:sectPr>
-      </w:pPr>
-    </w:p>
-    <w:p>
-      <w:pPr>
-        <w:spacing w:before="0" w:after="0" w:line="240" w:lineRule="auto"/>
+        <w:pageBreakBefore/>
       </w:pPr>
       <w:r>
         <w:drawing>
           <wp:inline xmlns:a="http://schemas.openxmlformats.org/drawingml/2006/main" xmlns:pic="http://schemas.openxmlformats.org/drawingml/2006/picture">
-            <wp:extent cx="7567200" cy="10702800"/>
+            <wp:extent cx="7510938" cy="10620000"/>
             <wp:docPr id="13" name="Picture 13"/>
             <wp:cNvGraphicFramePr>
               <a:graphicFrameLocks noChangeAspect="1"/>
@@ -606,7 +483,7 @@
               <a:graphicData uri="http://schemas.openxmlformats.org/drawingml/2006/picture">
                 <pic:pic>
                   <pic:nvPicPr>
-                    <pic:cNvPr id="0" name="image.jpg"/>
+                    <pic:cNvPr id="0" name="13.png"/>
                     <pic:cNvPicPr/>
                   </pic:nvPicPr>
                   <pic:blipFill>
@@ -618,7 +495,7 @@
                   <pic:spPr>
                     <a:xfrm>
                       <a:off x="0" y="0"/>
-                      <a:ext cx="7567200" cy="10702800"/>
+                      <a:ext cx="7510938" cy="10620000"/>
                     </a:xfrm>
                     <a:prstGeom prst="rect"/>
                   </pic:spPr>
@@ -631,22 +508,12 @@
     </w:p>
     <w:p>
       <w:pPr>
-        <w:sectPr>
-          <w:pgSz w:w="11917" w:h="16855"/>
-          <w:pgMar w:top="0" w:right="0" w:bottom="0" w:left="0" w:header="0" w:footer="0" w:gutter="0"/>
-          <w:cols w:space="720"/>
-          <w:docGrid w:linePitch="360"/>
-        </w:sectPr>
-      </w:pPr>
-    </w:p>
-    <w:p>
-      <w:pPr>
-        <w:spacing w:before="0" w:after="0" w:line="240" w:lineRule="auto"/>
+        <w:pageBreakBefore/>
       </w:pPr>
       <w:r>
         <w:drawing>
           <wp:inline xmlns:a="http://schemas.openxmlformats.org/drawingml/2006/main" xmlns:pic="http://schemas.openxmlformats.org/drawingml/2006/picture">
-            <wp:extent cx="7567200" cy="10702800"/>
+            <wp:extent cx="7510938" cy="10620000"/>
             <wp:docPr id="14" name="Picture 14"/>
             <wp:cNvGraphicFramePr>
               <a:graphicFrameLocks noChangeAspect="1"/>
@@ -655,7 +522,7 @@
               <a:graphicData uri="http://schemas.openxmlformats.org/drawingml/2006/picture">
                 <pic:pic>
                   <pic:nvPicPr>
-                    <pic:cNvPr id="0" name="image.jpg"/>
+                    <pic:cNvPr id="0" name="14.png"/>
                     <pic:cNvPicPr/>
                   </pic:nvPicPr>
                   <pic:blipFill>
@@ -667,7 +534,7 @@
                   <pic:spPr>
                     <a:xfrm>
                       <a:off x="0" y="0"/>
-                      <a:ext cx="7567200" cy="10702800"/>
+                      <a:ext cx="7510938" cy="10620000"/>
                     </a:xfrm>
                     <a:prstGeom prst="rect"/>
                   </pic:spPr>
@@ -680,22 +547,12 @@
     </w:p>
     <w:p>
       <w:pPr>
-        <w:sectPr>
-          <w:pgSz w:w="11917" w:h="16855"/>
-          <w:pgMar w:top="0" w:right="0" w:bottom="0" w:left="0" w:header="0" w:footer="0" w:gutter="0"/>
-          <w:cols w:space="720"/>
-          <w:docGrid w:linePitch="360"/>
-        </w:sectPr>
-      </w:pPr>
-    </w:p>
-    <w:p>
-      <w:pPr>
-        <w:spacing w:before="0" w:after="0" w:line="240" w:lineRule="auto"/>
+        <w:pageBreakBefore/>
       </w:pPr>
       <w:r>
         <w:drawing>
           <wp:inline xmlns:a="http://schemas.openxmlformats.org/drawingml/2006/main" xmlns:pic="http://schemas.openxmlformats.org/drawingml/2006/picture">
-            <wp:extent cx="7567200" cy="10702800"/>
+            <wp:extent cx="7510938" cy="10620000"/>
             <wp:docPr id="15" name="Picture 15"/>
             <wp:cNvGraphicFramePr>
               <a:graphicFrameLocks noChangeAspect="1"/>
@@ -704,7 +561,7 @@
               <a:graphicData uri="http://schemas.openxmlformats.org/drawingml/2006/picture">
                 <pic:pic>
                   <pic:nvPicPr>
-                    <pic:cNvPr id="0" name="image.jpg"/>
+                    <pic:cNvPr id="0" name="15.png"/>
                     <pic:cNvPicPr/>
                   </pic:nvPicPr>
                   <pic:blipFill>
@@ -716,7 +573,7 @@
                   <pic:spPr>
                     <a:xfrm>
                       <a:off x="0" y="0"/>
-                      <a:ext cx="7567200" cy="10702800"/>
+                      <a:ext cx="7510938" cy="10620000"/>
                     </a:xfrm>
                     <a:prstGeom prst="rect"/>
                   </pic:spPr>
@@ -729,22 +586,12 @@
     </w:p>
     <w:p>
       <w:pPr>
-        <w:sectPr>
-          <w:pgSz w:w="11917" w:h="16855"/>
-          <w:pgMar w:top="0" w:right="0" w:bottom="0" w:left="0" w:header="0" w:footer="0" w:gutter="0"/>
-          <w:cols w:space="720"/>
-          <w:docGrid w:linePitch="360"/>
-        </w:sectPr>
-      </w:pPr>
-    </w:p>
-    <w:p>
-      <w:pPr>
-        <w:spacing w:before="0" w:after="0" w:line="240" w:lineRule="auto"/>
+        <w:pageBreakBefore/>
       </w:pPr>
       <w:r>
         <w:drawing>
           <wp:inline xmlns:a="http://schemas.openxmlformats.org/drawingml/2006/main" xmlns:pic="http://schemas.openxmlformats.org/drawingml/2006/picture">
-            <wp:extent cx="7567200" cy="10702800"/>
+            <wp:extent cx="7510938" cy="10620000"/>
             <wp:docPr id="16" name="Picture 16"/>
             <wp:cNvGraphicFramePr>
               <a:graphicFrameLocks noChangeAspect="1"/>
@@ -753,7 +600,7 @@
               <a:graphicData uri="http://schemas.openxmlformats.org/drawingml/2006/picture">
                 <pic:pic>
                   <pic:nvPicPr>
-                    <pic:cNvPr id="0" name="image.jpg"/>
+                    <pic:cNvPr id="0" name="16.png"/>
                     <pic:cNvPicPr/>
                   </pic:nvPicPr>
                   <pic:blipFill>
@@ -765,7 +612,7 @@
                   <pic:spPr>
                     <a:xfrm>
                       <a:off x="0" y="0"/>
-                      <a:ext cx="7567200" cy="10702800"/>
+                      <a:ext cx="7510938" cy="10620000"/>
                     </a:xfrm>
                     <a:prstGeom prst="rect"/>
                   </pic:spPr>
@@ -778,22 +625,12 @@
     </w:p>
     <w:p>
       <w:pPr>
-        <w:sectPr>
-          <w:pgSz w:w="11917" w:h="16855"/>
-          <w:pgMar w:top="0" w:right="0" w:bottom="0" w:left="0" w:header="0" w:footer="0" w:gutter="0"/>
-          <w:cols w:space="720"/>
-          <w:docGrid w:linePitch="360"/>
-        </w:sectPr>
-      </w:pPr>
-    </w:p>
-    <w:p>
-      <w:pPr>
-        <w:spacing w:before="0" w:after="0" w:line="240" w:lineRule="auto"/>
+        <w:pageBreakBefore/>
       </w:pPr>
       <w:r>
         <w:drawing>
           <wp:inline xmlns:a="http://schemas.openxmlformats.org/drawingml/2006/main" xmlns:pic="http://schemas.openxmlformats.org/drawingml/2006/picture">
-            <wp:extent cx="7567200" cy="10702800"/>
+            <wp:extent cx="7510938" cy="10620000"/>
             <wp:docPr id="17" name="Picture 17"/>
             <wp:cNvGraphicFramePr>
               <a:graphicFrameLocks noChangeAspect="1"/>
@@ -802,7 +639,7 @@
               <a:graphicData uri="http://schemas.openxmlformats.org/drawingml/2006/picture">
                 <pic:pic>
                   <pic:nvPicPr>
-                    <pic:cNvPr id="0" name="image.jpg"/>
+                    <pic:cNvPr id="0" name="17.png"/>
                     <pic:cNvPicPr/>
                   </pic:nvPicPr>
                   <pic:blipFill>
@@ -814,7 +651,7 @@
                   <pic:spPr>
                     <a:xfrm>
                       <a:off x="0" y="0"/>
-                      <a:ext cx="7567200" cy="10702800"/>
+                      <a:ext cx="7510938" cy="10620000"/>
                     </a:xfrm>
                     <a:prstGeom prst="rect"/>
                   </pic:spPr>
@@ -827,22 +664,12 @@
     </w:p>
     <w:p>
       <w:pPr>
-        <w:sectPr>
-          <w:pgSz w:w="11917" w:h="16855"/>
-          <w:pgMar w:top="0" w:right="0" w:bottom="0" w:left="0" w:header="0" w:footer="0" w:gutter="0"/>
-          <w:cols w:space="720"/>
-          <w:docGrid w:linePitch="360"/>
-        </w:sectPr>
-      </w:pPr>
-    </w:p>
-    <w:p>
-      <w:pPr>
-        <w:spacing w:before="0" w:after="0" w:line="240" w:lineRule="auto"/>
+        <w:pageBreakBefore/>
       </w:pPr>
       <w:r>
         <w:drawing>
           <wp:inline xmlns:a="http://schemas.openxmlformats.org/drawingml/2006/main" xmlns:pic="http://schemas.openxmlformats.org/drawingml/2006/picture">
-            <wp:extent cx="7567200" cy="10702800"/>
+            <wp:extent cx="7510938" cy="10620000"/>
             <wp:docPr id="18" name="Picture 18"/>
             <wp:cNvGraphicFramePr>
               <a:graphicFrameLocks noChangeAspect="1"/>
@@ -851,7 +678,7 @@
               <a:graphicData uri="http://schemas.openxmlformats.org/drawingml/2006/picture">
                 <pic:pic>
                   <pic:nvPicPr>
-                    <pic:cNvPr id="0" name="image.jpg"/>
+                    <pic:cNvPr id="0" name="18.png"/>
                     <pic:cNvPicPr/>
                   </pic:nvPicPr>
                   <pic:blipFill>
@@ -863,7 +690,7 @@
                   <pic:spPr>
                     <a:xfrm>
                       <a:off x="0" y="0"/>
-                      <a:ext cx="7567200" cy="10702800"/>
+                      <a:ext cx="7510938" cy="10620000"/>
                     </a:xfrm>
                     <a:prstGeom prst="rect"/>
                   </pic:spPr>
@@ -876,22 +703,12 @@
     </w:p>
     <w:p>
       <w:pPr>
-        <w:sectPr>
-          <w:pgSz w:w="11917" w:h="16855"/>
-          <w:pgMar w:top="0" w:right="0" w:bottom="0" w:left="0" w:header="0" w:footer="0" w:gutter="0"/>
-          <w:cols w:space="720"/>
-          <w:docGrid w:linePitch="360"/>
-        </w:sectPr>
-      </w:pPr>
-    </w:p>
-    <w:p>
-      <w:pPr>
-        <w:spacing w:before="0" w:after="0" w:line="240" w:lineRule="auto"/>
+        <w:pageBreakBefore/>
       </w:pPr>
       <w:r>
         <w:drawing>
           <wp:inline xmlns:a="http://schemas.openxmlformats.org/drawingml/2006/main" xmlns:pic="http://schemas.openxmlformats.org/drawingml/2006/picture">
-            <wp:extent cx="7567200" cy="10702800"/>
+            <wp:extent cx="7510938" cy="10620000"/>
             <wp:docPr id="19" name="Picture 19"/>
             <wp:cNvGraphicFramePr>
               <a:graphicFrameLocks noChangeAspect="1"/>
@@ -900,7 +717,7 @@
               <a:graphicData uri="http://schemas.openxmlformats.org/drawingml/2006/picture">
                 <pic:pic>
                   <pic:nvPicPr>
-                    <pic:cNvPr id="0" name="image.jpg"/>
+                    <pic:cNvPr id="0" name="19.png"/>
                     <pic:cNvPicPr/>
                   </pic:nvPicPr>
                   <pic:blipFill>
@@ -912,7 +729,7 @@
                   <pic:spPr>
                     <a:xfrm>
                       <a:off x="0" y="0"/>
-                      <a:ext cx="7567200" cy="10702800"/>
+                      <a:ext cx="7510938" cy="10620000"/>
                     </a:xfrm>
                     <a:prstGeom prst="rect"/>
                   </pic:spPr>
@@ -925,22 +742,12 @@
     </w:p>
     <w:p>
       <w:pPr>
-        <w:sectPr>
-          <w:pgSz w:w="11917" w:h="16855"/>
-          <w:pgMar w:top="0" w:right="0" w:bottom="0" w:left="0" w:header="0" w:footer="0" w:gutter="0"/>
-          <w:cols w:space="720"/>
-          <w:docGrid w:linePitch="360"/>
-        </w:sectPr>
-      </w:pPr>
-    </w:p>
-    <w:p>
-      <w:pPr>
-        <w:spacing w:before="0" w:after="0" w:line="240" w:lineRule="auto"/>
+        <w:pageBreakBefore/>
       </w:pPr>
       <w:r>
         <w:drawing>
           <wp:inline xmlns:a="http://schemas.openxmlformats.org/drawingml/2006/main" xmlns:pic="http://schemas.openxmlformats.org/drawingml/2006/picture">
-            <wp:extent cx="7567200" cy="10702800"/>
+            <wp:extent cx="7510938" cy="10620000"/>
             <wp:docPr id="20" name="Picture 20"/>
             <wp:cNvGraphicFramePr>
               <a:graphicFrameLocks noChangeAspect="1"/>
@@ -949,7 +756,7 @@
               <a:graphicData uri="http://schemas.openxmlformats.org/drawingml/2006/picture">
                 <pic:pic>
                   <pic:nvPicPr>
-                    <pic:cNvPr id="0" name="image.jpg"/>
+                    <pic:cNvPr id="0" name="20.png"/>
                     <pic:cNvPicPr/>
                   </pic:nvPicPr>
                   <pic:blipFill>
@@ -961,7 +768,7 @@
                   <pic:spPr>
                     <a:xfrm>
                       <a:off x="0" y="0"/>
-                      <a:ext cx="7567200" cy="10702800"/>
+                      <a:ext cx="7510938" cy="10620000"/>
                     </a:xfrm>
                     <a:prstGeom prst="rect"/>
                   </pic:spPr>
@@ -974,22 +781,12 @@
     </w:p>
     <w:p>
       <w:pPr>
-        <w:sectPr>
-          <w:pgSz w:w="11917" w:h="16855"/>
-          <w:pgMar w:top="0" w:right="0" w:bottom="0" w:left="0" w:header="0" w:footer="0" w:gutter="0"/>
-          <w:cols w:space="720"/>
-          <w:docGrid w:linePitch="360"/>
-        </w:sectPr>
-      </w:pPr>
-    </w:p>
-    <w:p>
-      <w:pPr>
-        <w:spacing w:before="0" w:after="0" w:line="240" w:lineRule="auto"/>
+        <w:pageBreakBefore/>
       </w:pPr>
       <w:r>
         <w:drawing>
           <wp:inline xmlns:a="http://schemas.openxmlformats.org/drawingml/2006/main" xmlns:pic="http://schemas.openxmlformats.org/drawingml/2006/picture">
-            <wp:extent cx="7567200" cy="10702800"/>
+            <wp:extent cx="7510938" cy="10620000"/>
             <wp:docPr id="21" name="Picture 21"/>
             <wp:cNvGraphicFramePr>
               <a:graphicFrameLocks noChangeAspect="1"/>
@@ -998,7 +795,7 @@
               <a:graphicData uri="http://schemas.openxmlformats.org/drawingml/2006/picture">
                 <pic:pic>
                   <pic:nvPicPr>
-                    <pic:cNvPr id="0" name="image.jpg"/>
+                    <pic:cNvPr id="0" name="21.png"/>
                     <pic:cNvPicPr/>
                   </pic:nvPicPr>
                   <pic:blipFill>
@@ -1010,7 +807,7 @@
                   <pic:spPr>
                     <a:xfrm>
                       <a:off x="0" y="0"/>
-                      <a:ext cx="7567200" cy="10702800"/>
+                      <a:ext cx="7510938" cy="10620000"/>
                     </a:xfrm>
                     <a:prstGeom prst="rect"/>
                   </pic:spPr>
@@ -1023,22 +820,12 @@
     </w:p>
     <w:p>
       <w:pPr>
-        <w:sectPr>
-          <w:pgSz w:w="11917" w:h="16855"/>
-          <w:pgMar w:top="0" w:right="0" w:bottom="0" w:left="0" w:header="0" w:footer="0" w:gutter="0"/>
-          <w:cols w:space="720"/>
-          <w:docGrid w:linePitch="360"/>
-        </w:sectPr>
-      </w:pPr>
-    </w:p>
-    <w:p>
-      <w:pPr>
-        <w:spacing w:before="0" w:after="0" w:line="240" w:lineRule="auto"/>
+        <w:pageBreakBefore/>
       </w:pPr>
       <w:r>
         <w:drawing>
           <wp:inline xmlns:a="http://schemas.openxmlformats.org/drawingml/2006/main" xmlns:pic="http://schemas.openxmlformats.org/drawingml/2006/picture">
-            <wp:extent cx="7567200" cy="10702800"/>
+            <wp:extent cx="7510938" cy="10620000"/>
             <wp:docPr id="22" name="Picture 22"/>
             <wp:cNvGraphicFramePr>
               <a:graphicFrameLocks noChangeAspect="1"/>
@@ -1047,7 +834,7 @@
               <a:graphicData uri="http://schemas.openxmlformats.org/drawingml/2006/picture">
                 <pic:pic>
                   <pic:nvPicPr>
-                    <pic:cNvPr id="0" name="image.jpg"/>
+                    <pic:cNvPr id="0" name="22.png"/>
                     <pic:cNvPicPr/>
                   </pic:nvPicPr>
                   <pic:blipFill>
@@ -1059,7 +846,7 @@
                   <pic:spPr>
                     <a:xfrm>
                       <a:off x="0" y="0"/>
-                      <a:ext cx="7567200" cy="10702800"/>
+                      <a:ext cx="7510938" cy="10620000"/>
                     </a:xfrm>
                     <a:prstGeom prst="rect"/>
                   </pic:spPr>
@@ -1072,22 +859,12 @@
     </w:p>
     <w:p>
       <w:pPr>
-        <w:sectPr>
-          <w:pgSz w:w="11917" w:h="16855"/>
-          <w:pgMar w:top="0" w:right="0" w:bottom="0" w:left="0" w:header="0" w:footer="0" w:gutter="0"/>
-          <w:cols w:space="720"/>
-          <w:docGrid w:linePitch="360"/>
-        </w:sectPr>
-      </w:pPr>
-    </w:p>
-    <w:p>
-      <w:pPr>
-        <w:spacing w:before="0" w:after="0" w:line="240" w:lineRule="auto"/>
+        <w:pageBreakBefore/>
       </w:pPr>
       <w:r>
         <w:drawing>
           <wp:inline xmlns:a="http://schemas.openxmlformats.org/drawingml/2006/main" xmlns:pic="http://schemas.openxmlformats.org/drawingml/2006/picture">
-            <wp:extent cx="7567200" cy="10702800"/>
+            <wp:extent cx="7510938" cy="10620000"/>
             <wp:docPr id="23" name="Picture 23"/>
             <wp:cNvGraphicFramePr>
               <a:graphicFrameLocks noChangeAspect="1"/>
@@ -1096,7 +873,7 @@
               <a:graphicData uri="http://schemas.openxmlformats.org/drawingml/2006/picture">
                 <pic:pic>
                   <pic:nvPicPr>
-                    <pic:cNvPr id="0" name="image.jpg"/>
+                    <pic:cNvPr id="0" name="23.png"/>
                     <pic:cNvPicPr/>
                   </pic:nvPicPr>
                   <pic:blipFill>
@@ -1108,7 +885,7 @@
                   <pic:spPr>
                     <a:xfrm>
                       <a:off x="0" y="0"/>
-                      <a:ext cx="7567200" cy="10702800"/>
+                      <a:ext cx="7510938" cy="10620000"/>
                     </a:xfrm>
                     <a:prstGeom prst="rect"/>
                   </pic:spPr>
@@ -1121,22 +898,12 @@
     </w:p>
     <w:p>
       <w:pPr>
-        <w:sectPr>
-          <w:pgSz w:w="11917" w:h="16855"/>
-          <w:pgMar w:top="0" w:right="0" w:bottom="0" w:left="0" w:header="0" w:footer="0" w:gutter="0"/>
-          <w:cols w:space="720"/>
-          <w:docGrid w:linePitch="360"/>
-        </w:sectPr>
-      </w:pPr>
-    </w:p>
-    <w:p>
-      <w:pPr>
-        <w:spacing w:before="0" w:after="0" w:line="240" w:lineRule="auto"/>
+        <w:pageBreakBefore/>
       </w:pPr>
       <w:r>
         <w:drawing>
           <wp:inline xmlns:a="http://schemas.openxmlformats.org/drawingml/2006/main" xmlns:pic="http://schemas.openxmlformats.org/drawingml/2006/picture">
-            <wp:extent cx="7567200" cy="10702800"/>
+            <wp:extent cx="7510938" cy="10620000"/>
             <wp:docPr id="24" name="Picture 24"/>
             <wp:cNvGraphicFramePr>
               <a:graphicFrameLocks noChangeAspect="1"/>
@@ -1145,7 +912,7 @@
               <a:graphicData uri="http://schemas.openxmlformats.org/drawingml/2006/picture">
                 <pic:pic>
                   <pic:nvPicPr>
-                    <pic:cNvPr id="0" name="image.jpg"/>
+                    <pic:cNvPr id="0" name="24.png"/>
                     <pic:cNvPicPr/>
                   </pic:nvPicPr>
                   <pic:blipFill>
@@ -1157,7 +924,7 @@
                   <pic:spPr>
                     <a:xfrm>
                       <a:off x="0" y="0"/>
-                      <a:ext cx="7567200" cy="10702800"/>
+                      <a:ext cx="7510938" cy="10620000"/>
                     </a:xfrm>
                     <a:prstGeom prst="rect"/>
                   </pic:spPr>
@@ -1170,22 +937,12 @@
     </w:p>
     <w:p>
       <w:pPr>
-        <w:sectPr>
-          <w:pgSz w:w="11917" w:h="16855"/>
-          <w:pgMar w:top="0" w:right="0" w:bottom="0" w:left="0" w:header="0" w:footer="0" w:gutter="0"/>
-          <w:cols w:space="720"/>
-          <w:docGrid w:linePitch="360"/>
-        </w:sectPr>
-      </w:pPr>
-    </w:p>
-    <w:p>
-      <w:pPr>
-        <w:spacing w:before="0" w:after="0" w:line="240" w:lineRule="auto"/>
+        <w:pageBreakBefore/>
       </w:pPr>
       <w:r>
         <w:drawing>
           <wp:inline xmlns:a="http://schemas.openxmlformats.org/drawingml/2006/main" xmlns:pic="http://schemas.openxmlformats.org/drawingml/2006/picture">
-            <wp:extent cx="7567200" cy="10702800"/>
+            <wp:extent cx="7510938" cy="10620000"/>
             <wp:docPr id="25" name="Picture 25"/>
             <wp:cNvGraphicFramePr>
               <a:graphicFrameLocks noChangeAspect="1"/>
@@ -1194,7 +951,7 @@
               <a:graphicData uri="http://schemas.openxmlformats.org/drawingml/2006/picture">
                 <pic:pic>
                   <pic:nvPicPr>
-                    <pic:cNvPr id="0" name="image.jpg"/>
+                    <pic:cNvPr id="0" name="25.png"/>
                     <pic:cNvPicPr/>
                   </pic:nvPicPr>
                   <pic:blipFill>
@@ -1206,7 +963,7 @@
                   <pic:spPr>
                     <a:xfrm>
                       <a:off x="0" y="0"/>
-                      <a:ext cx="7567200" cy="10702800"/>
+                      <a:ext cx="7510938" cy="10620000"/>
                     </a:xfrm>
                     <a:prstGeom prst="rect"/>
                   </pic:spPr>
@@ -1219,22 +976,12 @@
     </w:p>
     <w:p>
       <w:pPr>
-        <w:sectPr>
-          <w:pgSz w:w="11917" w:h="16855"/>
-          <w:pgMar w:top="0" w:right="0" w:bottom="0" w:left="0" w:header="0" w:footer="0" w:gutter="0"/>
-          <w:cols w:space="720"/>
-          <w:docGrid w:linePitch="360"/>
-        </w:sectPr>
-      </w:pPr>
-    </w:p>
-    <w:p>
-      <w:pPr>
-        <w:spacing w:before="0" w:after="0" w:line="240" w:lineRule="auto"/>
+        <w:pageBreakBefore/>
       </w:pPr>
       <w:r>
         <w:drawing>
           <wp:inline xmlns:a="http://schemas.openxmlformats.org/drawingml/2006/main" xmlns:pic="http://schemas.openxmlformats.org/drawingml/2006/picture">
-            <wp:extent cx="7567200" cy="10702800"/>
+            <wp:extent cx="7510938" cy="10620000"/>
             <wp:docPr id="26" name="Picture 26"/>
             <wp:cNvGraphicFramePr>
               <a:graphicFrameLocks noChangeAspect="1"/>
@@ -1243,7 +990,7 @@
               <a:graphicData uri="http://schemas.openxmlformats.org/drawingml/2006/picture">
                 <pic:pic>
                   <pic:nvPicPr>
-                    <pic:cNvPr id="0" name="image.jpg"/>
+                    <pic:cNvPr id="0" name="26.png"/>
                     <pic:cNvPicPr/>
                   </pic:nvPicPr>
                   <pic:blipFill>
@@ -1255,7 +1002,7 @@
                   <pic:spPr>
                     <a:xfrm>
                       <a:off x="0" y="0"/>
-                      <a:ext cx="7567200" cy="10702800"/>
+                      <a:ext cx="7510938" cy="10620000"/>
                     </a:xfrm>
                     <a:prstGeom prst="rect"/>
                   </pic:spPr>
@@ -1268,22 +1015,12 @@
     </w:p>
     <w:p>
       <w:pPr>
-        <w:sectPr>
-          <w:pgSz w:w="11917" w:h="16855"/>
-          <w:pgMar w:top="0" w:right="0" w:bottom="0" w:left="0" w:header="0" w:footer="0" w:gutter="0"/>
-          <w:cols w:space="720"/>
-          <w:docGrid w:linePitch="360"/>
-        </w:sectPr>
-      </w:pPr>
-    </w:p>
-    <w:p>
-      <w:pPr>
-        <w:spacing w:before="0" w:after="0" w:line="240" w:lineRule="auto"/>
+        <w:pageBreakBefore/>
       </w:pPr>
       <w:r>
         <w:drawing>
           <wp:inline xmlns:a="http://schemas.openxmlformats.org/drawingml/2006/main" xmlns:pic="http://schemas.openxmlformats.org/drawingml/2006/picture">
-            <wp:extent cx="7567200" cy="10702800"/>
+            <wp:extent cx="7510938" cy="10620000"/>
             <wp:docPr id="27" name="Picture 27"/>
             <wp:cNvGraphicFramePr>
               <a:graphicFrameLocks noChangeAspect="1"/>
@@ -1292,7 +1029,7 @@
               <a:graphicData uri="http://schemas.openxmlformats.org/drawingml/2006/picture">
                 <pic:pic>
                   <pic:nvPicPr>
-                    <pic:cNvPr id="0" name="image.jpg"/>
+                    <pic:cNvPr id="0" name="27.png"/>
                     <pic:cNvPicPr/>
                   </pic:nvPicPr>
                   <pic:blipFill>
@@ -1304,7 +1041,7 @@
                   <pic:spPr>
                     <a:xfrm>
                       <a:off x="0" y="0"/>
-                      <a:ext cx="7567200" cy="10702800"/>
+                      <a:ext cx="7510938" cy="10620000"/>
                     </a:xfrm>
                     <a:prstGeom prst="rect"/>
                   </pic:spPr>
@@ -1317,22 +1054,12 @@
     </w:p>
     <w:p>
       <w:pPr>
-        <w:sectPr>
-          <w:pgSz w:w="11917" w:h="16855"/>
-          <w:pgMar w:top="0" w:right="0" w:bottom="0" w:left="0" w:header="0" w:footer="0" w:gutter="0"/>
-          <w:cols w:space="720"/>
-          <w:docGrid w:linePitch="360"/>
-        </w:sectPr>
-      </w:pPr>
-    </w:p>
-    <w:p>
-      <w:pPr>
-        <w:spacing w:before="0" w:after="0" w:line="240" w:lineRule="auto"/>
+        <w:pageBreakBefore/>
       </w:pPr>
       <w:r>
         <w:drawing>
           <wp:inline xmlns:a="http://schemas.openxmlformats.org/drawingml/2006/main" xmlns:pic="http://schemas.openxmlformats.org/drawingml/2006/picture">
-            <wp:extent cx="7567200" cy="10702800"/>
+            <wp:extent cx="7510938" cy="10620000"/>
             <wp:docPr id="28" name="Picture 28"/>
             <wp:cNvGraphicFramePr>
               <a:graphicFrameLocks noChangeAspect="1"/>
@@ -1341,7 +1068,7 @@
               <a:graphicData uri="http://schemas.openxmlformats.org/drawingml/2006/picture">
                 <pic:pic>
                   <pic:nvPicPr>
-                    <pic:cNvPr id="0" name="image.jpg"/>
+                    <pic:cNvPr id="0" name="28.png"/>
                     <pic:cNvPicPr/>
                   </pic:nvPicPr>
                   <pic:blipFill>
@@ -1353,7 +1080,7 @@
                   <pic:spPr>
                     <a:xfrm>
                       <a:off x="0" y="0"/>
-                      <a:ext cx="7567200" cy="10702800"/>
+                      <a:ext cx="7510938" cy="10620000"/>
                     </a:xfrm>
                     <a:prstGeom prst="rect"/>
                   </pic:spPr>
@@ -1366,22 +1093,12 @@
     </w:p>
     <w:p>
       <w:pPr>
-        <w:sectPr>
-          <w:pgSz w:w="11917" w:h="16855"/>
-          <w:pgMar w:top="0" w:right="0" w:bottom="0" w:left="0" w:header="0" w:footer="0" w:gutter="0"/>
-          <w:cols w:space="720"/>
-          <w:docGrid w:linePitch="360"/>
-        </w:sectPr>
-      </w:pPr>
-    </w:p>
-    <w:p>
-      <w:pPr>
-        <w:spacing w:before="0" w:after="0" w:line="240" w:lineRule="auto"/>
+        <w:pageBreakBefore/>
       </w:pPr>
       <w:r>
         <w:drawing>
           <wp:inline xmlns:a="http://schemas.openxmlformats.org/drawingml/2006/main" xmlns:pic="http://schemas.openxmlformats.org/drawingml/2006/picture">
-            <wp:extent cx="7567200" cy="10702800"/>
+            <wp:extent cx="7510938" cy="10620000"/>
             <wp:docPr id="29" name="Picture 29"/>
             <wp:cNvGraphicFramePr>
               <a:graphicFrameLocks noChangeAspect="1"/>
@@ -1390,7 +1107,7 @@
               <a:graphicData uri="http://schemas.openxmlformats.org/drawingml/2006/picture">
                 <pic:pic>
                   <pic:nvPicPr>
-                    <pic:cNvPr id="0" name="image.jpg"/>
+                    <pic:cNvPr id="0" name="29.png"/>
                     <pic:cNvPicPr/>
                   </pic:nvPicPr>
                   <pic:blipFill>
@@ -1402,7 +1119,7 @@
                   <pic:spPr>
                     <a:xfrm>
                       <a:off x="0" y="0"/>
-                      <a:ext cx="7567200" cy="10702800"/>
+                      <a:ext cx="7510938" cy="10620000"/>
                     </a:xfrm>
                     <a:prstGeom prst="rect"/>
                   </pic:spPr>
@@ -1415,22 +1132,12 @@
     </w:p>
     <w:p>
       <w:pPr>
-        <w:sectPr>
-          <w:pgSz w:w="11917" w:h="16855"/>
-          <w:pgMar w:top="0" w:right="0" w:bottom="0" w:left="0" w:header="0" w:footer="0" w:gutter="0"/>
-          <w:cols w:space="720"/>
-          <w:docGrid w:linePitch="360"/>
-        </w:sectPr>
-      </w:pPr>
-    </w:p>
-    <w:p>
-      <w:pPr>
-        <w:spacing w:before="0" w:after="0" w:line="240" w:lineRule="auto"/>
+        <w:pageBreakBefore/>
       </w:pPr>
       <w:r>
         <w:drawing>
           <wp:inline xmlns:a="http://schemas.openxmlformats.org/drawingml/2006/main" xmlns:pic="http://schemas.openxmlformats.org/drawingml/2006/picture">
-            <wp:extent cx="7567200" cy="10702800"/>
+            <wp:extent cx="7510938" cy="10620000"/>
             <wp:docPr id="30" name="Picture 30"/>
             <wp:cNvGraphicFramePr>
               <a:graphicFrameLocks noChangeAspect="1"/>
@@ -1439,7 +1146,7 @@
               <a:graphicData uri="http://schemas.openxmlformats.org/drawingml/2006/picture">
                 <pic:pic>
                   <pic:nvPicPr>
-                    <pic:cNvPr id="0" name="image.jpg"/>
+                    <pic:cNvPr id="0" name="30.png"/>
                     <pic:cNvPicPr/>
                   </pic:nvPicPr>
                   <pic:blipFill>
@@ -1451,7 +1158,7 @@
                   <pic:spPr>
                     <a:xfrm>
                       <a:off x="0" y="0"/>
-                      <a:ext cx="7567200" cy="10702800"/>
+                      <a:ext cx="7510938" cy="10620000"/>
                     </a:xfrm>
                     <a:prstGeom prst="rect"/>
                   </pic:spPr>
@@ -1464,22 +1171,12 @@
     </w:p>
     <w:p>
       <w:pPr>
-        <w:sectPr>
-          <w:pgSz w:w="11917" w:h="16855"/>
-          <w:pgMar w:top="0" w:right="0" w:bottom="0" w:left="0" w:header="0" w:footer="0" w:gutter="0"/>
-          <w:cols w:space="720"/>
-          <w:docGrid w:linePitch="360"/>
-        </w:sectPr>
-      </w:pPr>
-    </w:p>
-    <w:p>
-      <w:pPr>
-        <w:spacing w:before="0" w:after="0" w:line="240" w:lineRule="auto"/>
+        <w:pageBreakBefore/>
       </w:pPr>
       <w:r>
         <w:drawing>
           <wp:inline xmlns:a="http://schemas.openxmlformats.org/drawingml/2006/main" xmlns:pic="http://schemas.openxmlformats.org/drawingml/2006/picture">
-            <wp:extent cx="7567200" cy="10702800"/>
+            <wp:extent cx="7510938" cy="10620000"/>
             <wp:docPr id="31" name="Picture 31"/>
             <wp:cNvGraphicFramePr>
               <a:graphicFrameLocks noChangeAspect="1"/>
@@ -1488,7 +1185,7 @@
               <a:graphicData uri="http://schemas.openxmlformats.org/drawingml/2006/picture">
                 <pic:pic>
                   <pic:nvPicPr>
-                    <pic:cNvPr id="0" name="image.jpg"/>
+                    <pic:cNvPr id="0" name="31.png"/>
                     <pic:cNvPicPr/>
                   </pic:nvPicPr>
                   <pic:blipFill>
@@ -1500,7 +1197,7 @@
                   <pic:spPr>
                     <a:xfrm>
                       <a:off x="0" y="0"/>
-                      <a:ext cx="7567200" cy="10702800"/>
+                      <a:ext cx="7510938" cy="10620000"/>
                     </a:xfrm>
                     <a:prstGeom prst="rect"/>
                   </pic:spPr>
@@ -1513,22 +1210,12 @@
     </w:p>
     <w:p>
       <w:pPr>
-        <w:sectPr>
-          <w:pgSz w:w="11917" w:h="16855"/>
-          <w:pgMar w:top="0" w:right="0" w:bottom="0" w:left="0" w:header="0" w:footer="0" w:gutter="0"/>
-          <w:cols w:space="720"/>
-          <w:docGrid w:linePitch="360"/>
-        </w:sectPr>
-      </w:pPr>
-    </w:p>
-    <w:p>
-      <w:pPr>
-        <w:spacing w:before="0" w:after="0" w:line="240" w:lineRule="auto"/>
+        <w:pageBreakBefore/>
       </w:pPr>
       <w:r>
         <w:drawing>
           <wp:inline xmlns:a="http://schemas.openxmlformats.org/drawingml/2006/main" xmlns:pic="http://schemas.openxmlformats.org/drawingml/2006/picture">
-            <wp:extent cx="7567200" cy="10702800"/>
+            <wp:extent cx="7510938" cy="10620000"/>
             <wp:docPr id="32" name="Picture 32"/>
             <wp:cNvGraphicFramePr>
               <a:graphicFrameLocks noChangeAspect="1"/>
@@ -1537,7 +1224,7 @@
               <a:graphicData uri="http://schemas.openxmlformats.org/drawingml/2006/picture">
                 <pic:pic>
                   <pic:nvPicPr>
-                    <pic:cNvPr id="0" name="image.jpg"/>
+                    <pic:cNvPr id="0" name="32.png"/>
                     <pic:cNvPicPr/>
                   </pic:nvPicPr>
                   <pic:blipFill>
@@ -1549,7 +1236,7 @@
                   <pic:spPr>
                     <a:xfrm>
                       <a:off x="0" y="0"/>
-                      <a:ext cx="7567200" cy="10702800"/>
+                      <a:ext cx="7510938" cy="10620000"/>
                     </a:xfrm>
                     <a:prstGeom prst="rect"/>
                   </pic:spPr>
@@ -1562,22 +1249,12 @@
     </w:p>
     <w:p>
       <w:pPr>
-        <w:sectPr>
-          <w:pgSz w:w="11917" w:h="16855"/>
-          <w:pgMar w:top="0" w:right="0" w:bottom="0" w:left="0" w:header="0" w:footer="0" w:gutter="0"/>
-          <w:cols w:space="720"/>
-          <w:docGrid w:linePitch="360"/>
-        </w:sectPr>
-      </w:pPr>
-    </w:p>
-    <w:p>
-      <w:pPr>
-        <w:spacing w:before="0" w:after="0" w:line="240" w:lineRule="auto"/>
+        <w:pageBreakBefore/>
       </w:pPr>
       <w:r>
         <w:drawing>
           <wp:inline xmlns:a="http://schemas.openxmlformats.org/drawingml/2006/main" xmlns:pic="http://schemas.openxmlformats.org/drawingml/2006/picture">
-            <wp:extent cx="7567200" cy="10702800"/>
+            <wp:extent cx="7510938" cy="10620000"/>
             <wp:docPr id="33" name="Picture 33"/>
             <wp:cNvGraphicFramePr>
               <a:graphicFrameLocks noChangeAspect="1"/>
@@ -1586,7 +1263,7 @@
               <a:graphicData uri="http://schemas.openxmlformats.org/drawingml/2006/picture">
                 <pic:pic>
                   <pic:nvPicPr>
-                    <pic:cNvPr id="0" name="image.jpg"/>
+                    <pic:cNvPr id="0" name="33.png"/>
                     <pic:cNvPicPr/>
                   </pic:nvPicPr>
                   <pic:blipFill>
@@ -1598,7 +1275,7 @@
                   <pic:spPr>
                     <a:xfrm>
                       <a:off x="0" y="0"/>
-                      <a:ext cx="7567200" cy="10702800"/>
+                      <a:ext cx="7510938" cy="10620000"/>
                     </a:xfrm>
                     <a:prstGeom prst="rect"/>
                   </pic:spPr>
@@ -1611,22 +1288,12 @@
     </w:p>
     <w:p>
       <w:pPr>
-        <w:sectPr>
-          <w:pgSz w:w="11917" w:h="16855"/>
-          <w:pgMar w:top="0" w:right="0" w:bottom="0" w:left="0" w:header="0" w:footer="0" w:gutter="0"/>
-          <w:cols w:space="720"/>
-          <w:docGrid w:linePitch="360"/>
-        </w:sectPr>
-      </w:pPr>
-    </w:p>
-    <w:p>
-      <w:pPr>
-        <w:spacing w:before="0" w:after="0" w:line="240" w:lineRule="auto"/>
+        <w:pageBreakBefore/>
       </w:pPr>
       <w:r>
         <w:drawing>
           <wp:inline xmlns:a="http://schemas.openxmlformats.org/drawingml/2006/main" xmlns:pic="http://schemas.openxmlformats.org/drawingml/2006/picture">
-            <wp:extent cx="7567200" cy="10702800"/>
+            <wp:extent cx="7510938" cy="10620000"/>
             <wp:docPr id="34" name="Picture 34"/>
             <wp:cNvGraphicFramePr>
               <a:graphicFrameLocks noChangeAspect="1"/>
@@ -1635,7 +1302,7 @@
               <a:graphicData uri="http://schemas.openxmlformats.org/drawingml/2006/picture">
                 <pic:pic>
                   <pic:nvPicPr>
-                    <pic:cNvPr id="0" name="image.jpg"/>
+                    <pic:cNvPr id="0" name="34.png"/>
                     <pic:cNvPicPr/>
                   </pic:nvPicPr>
                   <pic:blipFill>
@@ -1647,7 +1314,7 @@
                   <pic:spPr>
                     <a:xfrm>
                       <a:off x="0" y="0"/>
-                      <a:ext cx="7567200" cy="10702800"/>
+                      <a:ext cx="7510938" cy="10620000"/>
                     </a:xfrm>
                     <a:prstGeom prst="rect"/>
                   </pic:spPr>
@@ -1660,22 +1327,12 @@
     </w:p>
     <w:p>
       <w:pPr>
-        <w:sectPr>
-          <w:pgSz w:w="11917" w:h="16855"/>
-          <w:pgMar w:top="0" w:right="0" w:bottom="0" w:left="0" w:header="0" w:footer="0" w:gutter="0"/>
-          <w:cols w:space="720"/>
-          <w:docGrid w:linePitch="360"/>
-        </w:sectPr>
-      </w:pPr>
-    </w:p>
-    <w:p>
-      <w:pPr>
-        <w:spacing w:before="0" w:after="0" w:line="240" w:lineRule="auto"/>
+        <w:pageBreakBefore/>
       </w:pPr>
       <w:r>
         <w:drawing>
           <wp:inline xmlns:a="http://schemas.openxmlformats.org/drawingml/2006/main" xmlns:pic="http://schemas.openxmlformats.org/drawingml/2006/picture">
-            <wp:extent cx="7567200" cy="10702800"/>
+            <wp:extent cx="7510938" cy="10620000"/>
             <wp:docPr id="35" name="Picture 35"/>
             <wp:cNvGraphicFramePr>
               <a:graphicFrameLocks noChangeAspect="1"/>
@@ -1684,7 +1341,7 @@
               <a:graphicData uri="http://schemas.openxmlformats.org/drawingml/2006/picture">
                 <pic:pic>
                   <pic:nvPicPr>
-                    <pic:cNvPr id="0" name="image.jpg"/>
+                    <pic:cNvPr id="0" name="35.png"/>
                     <pic:cNvPicPr/>
                   </pic:nvPicPr>
                   <pic:blipFill>
@@ -1696,7 +1353,7 @@
                   <pic:spPr>
                     <a:xfrm>
                       <a:off x="0" y="0"/>
-                      <a:ext cx="7567200" cy="10702800"/>
+                      <a:ext cx="7510938" cy="10620000"/>
                     </a:xfrm>
                     <a:prstGeom prst="rect"/>
                   </pic:spPr>
@@ -1709,22 +1366,12 @@
     </w:p>
     <w:p>
       <w:pPr>
-        <w:sectPr>
-          <w:pgSz w:w="11917" w:h="16855"/>
-          <w:pgMar w:top="0" w:right="0" w:bottom="0" w:left="0" w:header="0" w:footer="0" w:gutter="0"/>
-          <w:cols w:space="720"/>
-          <w:docGrid w:linePitch="360"/>
-        </w:sectPr>
-      </w:pPr>
-    </w:p>
-    <w:p>
-      <w:pPr>
-        <w:spacing w:before="0" w:after="0" w:line="240" w:lineRule="auto"/>
+        <w:pageBreakBefore/>
       </w:pPr>
       <w:r>
         <w:drawing>
           <wp:inline xmlns:a="http://schemas.openxmlformats.org/drawingml/2006/main" xmlns:pic="http://schemas.openxmlformats.org/drawingml/2006/picture">
-            <wp:extent cx="7567200" cy="10702800"/>
+            <wp:extent cx="7510938" cy="10620000"/>
             <wp:docPr id="36" name="Picture 36"/>
             <wp:cNvGraphicFramePr>
               <a:graphicFrameLocks noChangeAspect="1"/>
@@ -1733,7 +1380,7 @@
               <a:graphicData uri="http://schemas.openxmlformats.org/drawingml/2006/picture">
                 <pic:pic>
                   <pic:nvPicPr>
-                    <pic:cNvPr id="0" name="image.jpg"/>
+                    <pic:cNvPr id="0" name="36.png"/>
                     <pic:cNvPicPr/>
                   </pic:nvPicPr>
                   <pic:blipFill>
@@ -1745,7 +1392,7 @@
                   <pic:spPr>
                     <a:xfrm>
                       <a:off x="0" y="0"/>
-                      <a:ext cx="7567200" cy="10702800"/>
+                      <a:ext cx="7510938" cy="10620000"/>
                     </a:xfrm>
                     <a:prstGeom prst="rect"/>
                   </pic:spPr>
@@ -1758,22 +1405,12 @@
     </w:p>
     <w:p>
       <w:pPr>
-        <w:sectPr>
-          <w:pgSz w:w="11917" w:h="16855"/>
-          <w:pgMar w:top="0" w:right="0" w:bottom="0" w:left="0" w:header="0" w:footer="0" w:gutter="0"/>
-          <w:cols w:space="720"/>
-          <w:docGrid w:linePitch="360"/>
-        </w:sectPr>
-      </w:pPr>
-    </w:p>
-    <w:p>
-      <w:pPr>
-        <w:spacing w:before="0" w:after="0" w:line="240" w:lineRule="auto"/>
+        <w:pageBreakBefore/>
       </w:pPr>
       <w:r>
         <w:drawing>
           <wp:inline xmlns:a="http://schemas.openxmlformats.org/drawingml/2006/main" xmlns:pic="http://schemas.openxmlformats.org/drawingml/2006/picture">
-            <wp:extent cx="7567200" cy="10702800"/>
+            <wp:extent cx="7510938" cy="10620000"/>
             <wp:docPr id="37" name="Picture 37"/>
             <wp:cNvGraphicFramePr>
               <a:graphicFrameLocks noChangeAspect="1"/>
@@ -1782,7 +1419,7 @@
               <a:graphicData uri="http://schemas.openxmlformats.org/drawingml/2006/picture">
                 <pic:pic>
                   <pic:nvPicPr>
-                    <pic:cNvPr id="0" name="image.jpg"/>
+                    <pic:cNvPr id="0" name="37.png"/>
                     <pic:cNvPicPr/>
                   </pic:nvPicPr>
                   <pic:blipFill>
@@ -1794,7 +1431,7 @@
                   <pic:spPr>
                     <a:xfrm>
                       <a:off x="0" y="0"/>
-                      <a:ext cx="7567200" cy="10702800"/>
+                      <a:ext cx="7510938" cy="10620000"/>
                     </a:xfrm>
                     <a:prstGeom prst="rect"/>
                   </pic:spPr>
@@ -1807,22 +1444,12 @@
     </w:p>
     <w:p>
       <w:pPr>
-        <w:sectPr>
-          <w:pgSz w:w="11917" w:h="16855"/>
-          <w:pgMar w:top="0" w:right="0" w:bottom="0" w:left="0" w:header="0" w:footer="0" w:gutter="0"/>
-          <w:cols w:space="720"/>
-          <w:docGrid w:linePitch="360"/>
-        </w:sectPr>
-      </w:pPr>
-    </w:p>
-    <w:p>
-      <w:pPr>
-        <w:spacing w:before="0" w:after="0" w:line="240" w:lineRule="auto"/>
+        <w:pageBreakBefore/>
       </w:pPr>
       <w:r>
         <w:drawing>
           <wp:inline xmlns:a="http://schemas.openxmlformats.org/drawingml/2006/main" xmlns:pic="http://schemas.openxmlformats.org/drawingml/2006/picture">
-            <wp:extent cx="7567200" cy="10702800"/>
+            <wp:extent cx="7510938" cy="10620000"/>
             <wp:docPr id="38" name="Picture 38"/>
             <wp:cNvGraphicFramePr>
               <a:graphicFrameLocks noChangeAspect="1"/>
@@ -1831,7 +1458,7 @@
               <a:graphicData uri="http://schemas.openxmlformats.org/drawingml/2006/picture">
                 <pic:pic>
                   <pic:nvPicPr>
-                    <pic:cNvPr id="0" name="image.jpg"/>
+                    <pic:cNvPr id="0" name="38.png"/>
                     <pic:cNvPicPr/>
                   </pic:nvPicPr>
                   <pic:blipFill>
@@ -1843,7 +1470,7 @@
                   <pic:spPr>
                     <a:xfrm>
                       <a:off x="0" y="0"/>
-                      <a:ext cx="7567200" cy="10702800"/>
+                      <a:ext cx="7510938" cy="10620000"/>
                     </a:xfrm>
                     <a:prstGeom prst="rect"/>
                   </pic:spPr>
@@ -1856,22 +1483,12 @@
     </w:p>
     <w:p>
       <w:pPr>
-        <w:sectPr>
-          <w:pgSz w:w="11917" w:h="16855"/>
-          <w:pgMar w:top="0" w:right="0" w:bottom="0" w:left="0" w:header="0" w:footer="0" w:gutter="0"/>
-          <w:cols w:space="720"/>
-          <w:docGrid w:linePitch="360"/>
-        </w:sectPr>
-      </w:pPr>
-    </w:p>
-    <w:p>
-      <w:pPr>
-        <w:spacing w:before="0" w:after="0" w:line="240" w:lineRule="auto"/>
+        <w:pageBreakBefore/>
       </w:pPr>
       <w:r>
         <w:drawing>
           <wp:inline xmlns:a="http://schemas.openxmlformats.org/drawingml/2006/main" xmlns:pic="http://schemas.openxmlformats.org/drawingml/2006/picture">
-            <wp:extent cx="7567200" cy="10702800"/>
+            <wp:extent cx="7510938" cy="10620000"/>
             <wp:docPr id="39" name="Picture 39"/>
             <wp:cNvGraphicFramePr>
               <a:graphicFrameLocks noChangeAspect="1"/>
@@ -1880,7 +1497,7 @@
               <a:graphicData uri="http://schemas.openxmlformats.org/drawingml/2006/picture">
                 <pic:pic>
                   <pic:nvPicPr>
-                    <pic:cNvPr id="0" name="image.jpg"/>
+                    <pic:cNvPr id="0" name="39.png"/>
                     <pic:cNvPicPr/>
                   </pic:nvPicPr>
                   <pic:blipFill>
@@ -1892,7 +1509,7 @@
                   <pic:spPr>
                     <a:xfrm>
                       <a:off x="0" y="0"/>
-                      <a:ext cx="7567200" cy="10702800"/>
+                      <a:ext cx="7510938" cy="10620000"/>
                     </a:xfrm>
                     <a:prstGeom prst="rect"/>
                   </pic:spPr>
@@ -1905,22 +1522,12 @@
     </w:p>
     <w:p>
       <w:pPr>
-        <w:sectPr>
-          <w:pgSz w:w="11917" w:h="16855"/>
-          <w:pgMar w:top="0" w:right="0" w:bottom="0" w:left="0" w:header="0" w:footer="0" w:gutter="0"/>
-          <w:cols w:space="720"/>
-          <w:docGrid w:linePitch="360"/>
-        </w:sectPr>
-      </w:pPr>
-    </w:p>
-    <w:p>
-      <w:pPr>
-        <w:spacing w:before="0" w:after="0" w:line="240" w:lineRule="auto"/>
+        <w:pageBreakBefore/>
       </w:pPr>
       <w:r>
         <w:drawing>
           <wp:inline xmlns:a="http://schemas.openxmlformats.org/drawingml/2006/main" xmlns:pic="http://schemas.openxmlformats.org/drawingml/2006/picture">
-            <wp:extent cx="7567200" cy="10702800"/>
+            <wp:extent cx="7510938" cy="10620000"/>
             <wp:docPr id="40" name="Picture 40"/>
             <wp:cNvGraphicFramePr>
               <a:graphicFrameLocks noChangeAspect="1"/>
@@ -1929,7 +1536,7 @@
               <a:graphicData uri="http://schemas.openxmlformats.org/drawingml/2006/picture">
                 <pic:pic>
                   <pic:nvPicPr>
-                    <pic:cNvPr id="0" name="image.jpg"/>
+                    <pic:cNvPr id="0" name="40.png"/>
                     <pic:cNvPicPr/>
                   </pic:nvPicPr>
                   <pic:blipFill>
@@ -1941,7 +1548,7 @@
                   <pic:spPr>
                     <a:xfrm>
                       <a:off x="0" y="0"/>
-                      <a:ext cx="7567200" cy="10702800"/>
+                      <a:ext cx="7510938" cy="10620000"/>
                     </a:xfrm>
                     <a:prstGeom prst="rect"/>
                   </pic:spPr>
@@ -1954,22 +1561,12 @@
     </w:p>
     <w:p>
       <w:pPr>
-        <w:sectPr>
-          <w:pgSz w:w="11917" w:h="16855"/>
-          <w:pgMar w:top="0" w:right="0" w:bottom="0" w:left="0" w:header="0" w:footer="0" w:gutter="0"/>
-          <w:cols w:space="720"/>
-          <w:docGrid w:linePitch="360"/>
-        </w:sectPr>
-      </w:pPr>
-    </w:p>
-    <w:p>
-      <w:pPr>
-        <w:spacing w:before="0" w:after="0" w:line="240" w:lineRule="auto"/>
+        <w:pageBreakBefore/>
       </w:pPr>
       <w:r>
         <w:drawing>
           <wp:inline xmlns:a="http://schemas.openxmlformats.org/drawingml/2006/main" xmlns:pic="http://schemas.openxmlformats.org/drawingml/2006/picture">
-            <wp:extent cx="7567200" cy="10702800"/>
+            <wp:extent cx="7510938" cy="10620000"/>
             <wp:docPr id="41" name="Picture 41"/>
             <wp:cNvGraphicFramePr>
               <a:graphicFrameLocks noChangeAspect="1"/>
@@ -1978,7 +1575,7 @@
               <a:graphicData uri="http://schemas.openxmlformats.org/drawingml/2006/picture">
                 <pic:pic>
                   <pic:nvPicPr>
-                    <pic:cNvPr id="0" name="image.jpg"/>
+                    <pic:cNvPr id="0" name="41.png"/>
                     <pic:cNvPicPr/>
                   </pic:nvPicPr>
                   <pic:blipFill>
@@ -1990,7 +1587,7 @@
                   <pic:spPr>
                     <a:xfrm>
                       <a:off x="0" y="0"/>
-                      <a:ext cx="7567200" cy="10702800"/>
+                      <a:ext cx="7510938" cy="10620000"/>
                     </a:xfrm>
                     <a:prstGeom prst="rect"/>
                   </pic:spPr>
@@ -2003,22 +1600,12 @@
     </w:p>
     <w:p>
       <w:pPr>
-        <w:sectPr>
-          <w:pgSz w:w="11917" w:h="16855"/>
-          <w:pgMar w:top="0" w:right="0" w:bottom="0" w:left="0" w:header="0" w:footer="0" w:gutter="0"/>
-          <w:cols w:space="720"/>
-          <w:docGrid w:linePitch="360"/>
-        </w:sectPr>
-      </w:pPr>
-    </w:p>
-    <w:p>
-      <w:pPr>
-        <w:spacing w:before="0" w:after="0" w:line="240" w:lineRule="auto"/>
+        <w:pageBreakBefore/>
       </w:pPr>
       <w:r>
         <w:drawing>
           <wp:inline xmlns:a="http://schemas.openxmlformats.org/drawingml/2006/main" xmlns:pic="http://schemas.openxmlformats.org/drawingml/2006/picture">
-            <wp:extent cx="7567200" cy="10702800"/>
+            <wp:extent cx="7510938" cy="10620000"/>
             <wp:docPr id="42" name="Picture 42"/>
             <wp:cNvGraphicFramePr>
               <a:graphicFrameLocks noChangeAspect="1"/>
@@ -2027,7 +1614,7 @@
               <a:graphicData uri="http://schemas.openxmlformats.org/drawingml/2006/picture">
                 <pic:pic>
                   <pic:nvPicPr>
-                    <pic:cNvPr id="0" name="image.jpg"/>
+                    <pic:cNvPr id="0" name="42.png"/>
                     <pic:cNvPicPr/>
                   </pic:nvPicPr>
                   <pic:blipFill>
@@ -2039,7 +1626,7 @@
                   <pic:spPr>
                     <a:xfrm>
                       <a:off x="0" y="0"/>
-                      <a:ext cx="7567200" cy="10702800"/>
+                      <a:ext cx="7510938" cy="10620000"/>
                     </a:xfrm>
                     <a:prstGeom prst="rect"/>
                   </pic:spPr>
@@ -2052,22 +1639,12 @@
     </w:p>
     <w:p>
       <w:pPr>
-        <w:sectPr>
-          <w:pgSz w:w="11917" w:h="16855"/>
-          <w:pgMar w:top="0" w:right="0" w:bottom="0" w:left="0" w:header="0" w:footer="0" w:gutter="0"/>
-          <w:cols w:space="720"/>
-          <w:docGrid w:linePitch="360"/>
-        </w:sectPr>
-      </w:pPr>
-    </w:p>
-    <w:p>
-      <w:pPr>
-        <w:spacing w:before="0" w:after="0" w:line="240" w:lineRule="auto"/>
+        <w:pageBreakBefore/>
       </w:pPr>
       <w:r>
         <w:drawing>
           <wp:inline xmlns:a="http://schemas.openxmlformats.org/drawingml/2006/main" xmlns:pic="http://schemas.openxmlformats.org/drawingml/2006/picture">
-            <wp:extent cx="7567200" cy="10702800"/>
+            <wp:extent cx="7510938" cy="10620000"/>
             <wp:docPr id="43" name="Picture 43"/>
             <wp:cNvGraphicFramePr>
               <a:graphicFrameLocks noChangeAspect="1"/>
@@ -2076,7 +1653,7 @@
               <a:graphicData uri="http://schemas.openxmlformats.org/drawingml/2006/picture">
                 <pic:pic>
                   <pic:nvPicPr>
-                    <pic:cNvPr id="0" name="image.jpg"/>
+                    <pic:cNvPr id="0" name="43.png"/>
                     <pic:cNvPicPr/>
                   </pic:nvPicPr>
                   <pic:blipFill>
@@ -2088,7 +1665,7 @@
                   <pic:spPr>
                     <a:xfrm>
                       <a:off x="0" y="0"/>
-                      <a:ext cx="7567200" cy="10702800"/>
+                      <a:ext cx="7510938" cy="10620000"/>
                     </a:xfrm>
                     <a:prstGeom prst="rect"/>
                   </pic:spPr>
@@ -2101,22 +1678,12 @@
     </w:p>
     <w:p>
       <w:pPr>
-        <w:sectPr>
-          <w:pgSz w:w="11917" w:h="16855"/>
-          <w:pgMar w:top="0" w:right="0" w:bottom="0" w:left="0" w:header="0" w:footer="0" w:gutter="0"/>
-          <w:cols w:space="720"/>
-          <w:docGrid w:linePitch="360"/>
-        </w:sectPr>
-      </w:pPr>
-    </w:p>
-    <w:p>
-      <w:pPr>
-        <w:spacing w:before="0" w:after="0" w:line="240" w:lineRule="auto"/>
+        <w:pageBreakBefore/>
       </w:pPr>
       <w:r>
         <w:drawing>
           <wp:inline xmlns:a="http://schemas.openxmlformats.org/drawingml/2006/main" xmlns:pic="http://schemas.openxmlformats.org/drawingml/2006/picture">
-            <wp:extent cx="7567200" cy="10702800"/>
+            <wp:extent cx="7510938" cy="10620000"/>
             <wp:docPr id="44" name="Picture 44"/>
             <wp:cNvGraphicFramePr>
               <a:graphicFrameLocks noChangeAspect="1"/>
@@ -2125,7 +1692,7 @@
               <a:graphicData uri="http://schemas.openxmlformats.org/drawingml/2006/picture">
                 <pic:pic>
                   <pic:nvPicPr>
-                    <pic:cNvPr id="0" name="image.jpg"/>
+                    <pic:cNvPr id="0" name="44.png"/>
                     <pic:cNvPicPr/>
                   </pic:nvPicPr>
                   <pic:blipFill>
@@ -2137,7 +1704,7 @@
                   <pic:spPr>
                     <a:xfrm>
                       <a:off x="0" y="0"/>
-                      <a:ext cx="7567200" cy="10702800"/>
+                      <a:ext cx="7510938" cy="10620000"/>
                     </a:xfrm>
                     <a:prstGeom prst="rect"/>
                   </pic:spPr>
@@ -2149,7 +1716,7 @@
       </w:r>
     </w:p>
     <w:sectPr>
-      <w:pgSz w:w="11917" w:h="16855"/>
+      <w:pgSz w:w="11906" w:h="16838"/>
       <w:pgMar w:top="0" w:right="0" w:bottom="0" w:left="0" w:header="0" w:footer="0" w:gutter="0"/>
       <w:cols w:space="720"/>
       <w:docGrid w:linePitch="360"/>
@@ -2521,6 +2088,9 @@
     <w:name w:val="Normal"/>
     <w:qFormat/>
     <w:rsid w:val="00FC693F"/>
+    <w:pPr>
+      <w:spacing w:after="0" w:line="240" w:lineRule="auto"/>
+    </w:pPr>
   </w:style>
   <w:style w:type="paragraph" w:styleId="Header">
     <w:name w:val="header"/>

</xml_diff>